<commit_message>
implement data classes for operation entities and dicts; improved storage operation methods
</commit_message>
<xml_diff>
--- a/Консольный трекер финансов.docx
+++ b/Консольный трекер финансов.docx
@@ -14,7 +14,7 @@
         <w:rPr>
           <w:lang w:val="ru-RU"/>
         </w:rPr>
-        <w:t>Контекст проекта</w:t>
+        <w:t>Контекст</w:t>
       </w:r>
     </w:p>
     <w:p>
@@ -28,7 +28,19 @@
         <w:rPr>
           <w:lang w:val="ru-RU"/>
         </w:rPr>
-        <w:t xml:space="preserve">Это учебный проект, но его цель — не просто изучить </w:t>
+        <w:t>Это учебный проект</w:t>
+      </w:r>
+      <w:r>
+        <w:rPr>
+          <w:lang w:val="ru-RU"/>
+        </w:rPr>
+        <w:t xml:space="preserve"> </w:t>
+      </w:r>
+      <w:r>
+        <w:rPr>
+          <w:lang w:val="ru-RU"/>
+        </w:rPr>
+        <w:t xml:space="preserve">с целью изучить </w:t>
       </w:r>
       <w:r>
         <w:t>Python</w:t>
@@ -37,7 +49,37 @@
         <w:rPr>
           <w:lang w:val="ru-RU"/>
         </w:rPr>
-        <w:t>, а научиться проектировать программное обеспечение. Поэтому при обсуждении кода приоритет отдаётся архитектуре, разделению ответственности и качеству проектирования, а не скорости написания функционала.</w:t>
+        <w:t xml:space="preserve"> и </w:t>
+      </w:r>
+      <w:r>
+        <w:rPr>
+          <w:lang w:val="ru-RU"/>
+        </w:rPr>
+        <w:t xml:space="preserve">научиться </w:t>
+      </w:r>
+      <w:r>
+        <w:rPr>
+          <w:lang w:val="ru-RU"/>
+        </w:rPr>
+        <w:t xml:space="preserve">базово </w:t>
+      </w:r>
+      <w:r>
+        <w:rPr>
+          <w:lang w:val="ru-RU"/>
+        </w:rPr>
+        <w:t xml:space="preserve">проектировать </w:t>
+      </w:r>
+      <w:r>
+        <w:rPr>
+          <w:lang w:val="ru-RU"/>
+        </w:rPr>
+        <w:t>ПО</w:t>
+      </w:r>
+      <w:r>
+        <w:rPr>
+          <w:lang w:val="ru-RU"/>
+        </w:rPr>
+        <w:t>. Поэтому при обсуждении кода приоритет отдаётся архитектуре, разделению ответственности и качеству проектирования.</w:t>
       </w:r>
     </w:p>
     <w:p>
@@ -74,7 +116,19 @@
         <w:rPr>
           <w:lang w:val="ru-RU"/>
         </w:rPr>
-        <w:t>Проект — консольный трекер финансов.</w:t>
+        <w:t xml:space="preserve">Проект </w:t>
+      </w:r>
+      <w:r>
+        <w:rPr>
+          <w:lang w:val="ru-RU"/>
+        </w:rPr>
+        <w:t>представляет собой консольный трекер финансов</w:t>
+      </w:r>
+      <w:r>
+        <w:rPr>
+          <w:lang w:val="ru-RU"/>
+        </w:rPr>
+        <w:t>.</w:t>
       </w:r>
     </w:p>
     <w:p>
@@ -97,16 +151,43 @@
         <w:rPr>
           <w:lang w:val="ru-RU"/>
         </w:rPr>
-        <w:t xml:space="preserve"> как хранилище данных. В будущем возможно перейти на </w:t>
-      </w:r>
-      <w:r>
-        <w:t>SQLite</w:t>
-      </w:r>
-      <w:r>
-        <w:rPr>
-          <w:lang w:val="ru-RU"/>
-        </w:rPr>
-        <w:t>, но текущая архитектура должна позволить сделать это с минимальными изменениями.</w:t>
+        <w:t xml:space="preserve"> как хранилище данных. </w:t>
+      </w:r>
+      <w:r>
+        <w:rPr>
+          <w:lang w:val="ru-RU"/>
+        </w:rPr>
+        <w:t xml:space="preserve">Предполагается переход на </w:t>
+      </w:r>
+      <w:r>
+        <w:t>SQL</w:t>
+      </w:r>
+      <w:r>
+        <w:rPr>
+          <w:lang w:val="ru-RU"/>
+        </w:rPr>
+        <w:t xml:space="preserve"> </w:t>
+      </w:r>
+      <w:r>
+        <w:rPr>
+          <w:lang w:val="ru-RU"/>
+        </w:rPr>
+        <w:t xml:space="preserve">базы данных и использование графического интерфейса. Реализуемая архитектура должна позволить сделать это с минимальными изменениями и позволить переключаться между способами отрисовки </w:t>
+      </w:r>
+      <w:r>
+        <w:t>UI</w:t>
+      </w:r>
+      <w:r>
+        <w:rPr>
+          <w:lang w:val="ru-RU"/>
+        </w:rPr>
+        <w:t xml:space="preserve"> </w:t>
+      </w:r>
+      <w:r>
+        <w:rPr>
+          <w:lang w:val="ru-RU"/>
+        </w:rPr>
+        <w:t>и хранениями данных.</w:t>
       </w:r>
     </w:p>
     <w:p>
@@ -129,7 +210,7 @@
         <w:rPr>
           <w:lang w:val="ru-RU"/>
         </w:rPr>
-        <w:t>Главная цель</w:t>
+        <w:t>Основная задача</w:t>
       </w:r>
     </w:p>
     <w:p>
@@ -143,7 +224,61 @@
         <w:rPr>
           <w:lang w:val="ru-RU"/>
         </w:rPr>
-        <w:t>Не написать программу “как получится”, а постепенно построить хорошую архитектуру.</w:t>
+        <w:t>Н</w:t>
+      </w:r>
+      <w:r>
+        <w:rPr>
+          <w:lang w:val="ru-RU"/>
+        </w:rPr>
+        <w:t xml:space="preserve">аписать программу </w:t>
+      </w:r>
+      <w:r>
+        <w:rPr>
+          <w:lang w:val="ru-RU"/>
+        </w:rPr>
+        <w:t>на «</w:t>
+      </w:r>
+      <w:r>
+        <w:rPr>
+          <w:lang w:val="ru-RU"/>
+        </w:rPr>
+        <w:t>как получится</w:t>
+      </w:r>
+      <w:r>
+        <w:rPr>
+          <w:lang w:val="ru-RU"/>
+        </w:rPr>
+        <w:t>»</w:t>
+      </w:r>
+      <w:r>
+        <w:rPr>
+          <w:lang w:val="ru-RU"/>
+        </w:rPr>
+        <w:t xml:space="preserve">, а постепенно </w:t>
+      </w:r>
+      <w:r>
+        <w:rPr>
+          <w:lang w:val="ru-RU"/>
+        </w:rPr>
+        <w:t>выстроить</w:t>
+      </w:r>
+      <w:r>
+        <w:rPr>
+          <w:lang w:val="ru-RU"/>
+        </w:rPr>
+        <w:t xml:space="preserve"> </w:t>
+      </w:r>
+      <w:r>
+        <w:rPr>
+          <w:lang w:val="ru-RU"/>
+        </w:rPr>
+        <w:t>удобную</w:t>
+      </w:r>
+      <w:r>
+        <w:rPr>
+          <w:lang w:val="ru-RU"/>
+        </w:rPr>
+        <w:t xml:space="preserve"> архитектуру.</w:t>
       </w:r>
     </w:p>
     <w:p>
@@ -157,7 +292,13 @@
         <w:rPr>
           <w:lang w:val="ru-RU"/>
         </w:rPr>
-        <w:t xml:space="preserve">Важно объяснять не только </w:t>
+        <w:t>Промпт для ИИ: в</w:t>
+      </w:r>
+      <w:r>
+        <w:rPr>
+          <w:lang w:val="ru-RU"/>
+        </w:rPr>
+        <w:t xml:space="preserve">ажно объяснять не только </w:t>
       </w:r>
       <w:r>
         <w:rPr>
@@ -186,6 +327,12 @@
           <w:lang w:val="ru-RU"/>
         </w:rPr>
         <w:t xml:space="preserve"> это изменение улучшает проект.</w:t>
+      </w:r>
+      <w:r>
+        <w:rPr>
+          <w:lang w:val="ru-RU"/>
+        </w:rPr>
+        <w:t xml:space="preserve"> Не следует гнаться за архитектурой и строить абстракции лишь по принципу «может пригодиться в будущем». Архитектура не должна опережать текущие задачи.</w:t>
       </w:r>
     </w:p>
     <w:p>
@@ -273,13 +420,8 @@
       <w:pPr>
         <w:pStyle w:val="a0"/>
       </w:pPr>
-      <w:proofErr w:type="spellStart"/>
-      <w:r>
-        <w:t>Он</w:t>
-      </w:r>
-      <w:proofErr w:type="spellEnd"/>
-      <w:r>
-        <w:t>:</w:t>
+      <w:r>
+        <w:t>Он:</w:t>
       </w:r>
     </w:p>
     <w:p>
@@ -303,7 +445,16 @@
         </w:numPr>
       </w:pPr>
       <w:r>
-        <w:t>получает ввод пользователя;</w:t>
+        <w:t>получает вво</w:t>
+      </w:r>
+      <w:r>
+        <w:rPr>
+          <w:lang w:val="ru-RU"/>
+        </w:rPr>
+        <w:t>д</w:t>
+      </w:r>
+      <w:r>
+        <w:t>;</w:t>
       </w:r>
     </w:p>
     <w:p>
@@ -332,6 +483,34 @@
     </w:p>
     <w:p>
       <w:pPr>
+        <w:pStyle w:val="Compact"/>
+        <w:numPr>
+          <w:ilvl w:val="0"/>
+          <w:numId w:val="2"/>
+        </w:numPr>
+        <w:rPr>
+          <w:lang w:val="ru-RU"/>
+        </w:rPr>
+      </w:pPr>
+      <w:r>
+        <w:rPr>
+          <w:lang w:val="ru-RU"/>
+        </w:rPr>
+        <w:lastRenderedPageBreak/>
+        <w:t xml:space="preserve">Обращается к данным через </w:t>
+      </w:r>
+      <w:r>
+        <w:t>FinanceManager</w:t>
+      </w:r>
+      <w:r>
+        <w:rPr>
+          <w:lang w:val="ru-RU"/>
+        </w:rPr>
+        <w:t>.</w:t>
+      </w:r>
+    </w:p>
+    <w:p>
+      <w:pPr>
         <w:pStyle w:val="FirstParagraph"/>
       </w:pPr>
       <w:r>
@@ -347,8 +526,19 @@
         </w:numPr>
       </w:pPr>
       <w:r>
-        <w:lastRenderedPageBreak/>
-        <w:t>как устроен JSON;</w:t>
+        <w:t>как устроен</w:t>
+      </w:r>
+      <w:r>
+        <w:rPr>
+          <w:lang w:val="ru-RU"/>
+        </w:rPr>
+        <w:t>о хранение (</w:t>
+      </w:r>
+      <w:r>
+        <w:t>Storage)</w:t>
+      </w:r>
+      <w:r>
+        <w:t>;</w:t>
       </w:r>
     </w:p>
     <w:p>
@@ -453,20 +643,51 @@
         <w:rPr>
           <w:lang w:val="ru-RU"/>
         </w:rPr>
-        <w:t xml:space="preserve"> отвечает только за хранение данных.</w:t>
+        <w:t xml:space="preserve"> – </w:t>
+      </w:r>
+      <w:r>
+        <w:rPr>
+          <w:lang w:val="ru-RU"/>
+        </w:rPr>
+        <w:t xml:space="preserve">самописное </w:t>
+      </w:r>
+      <w:r>
+        <w:t>API</w:t>
+      </w:r>
+      <w:r>
+        <w:rPr>
+          <w:lang w:val="ru-RU"/>
+        </w:rPr>
+        <w:t xml:space="preserve"> </w:t>
+      </w:r>
+      <w:r>
+        <w:rPr>
+          <w:lang w:val="ru-RU"/>
+        </w:rPr>
+        <w:t xml:space="preserve">для работы с </w:t>
+      </w:r>
+      <w:r>
+        <w:t>JSON</w:t>
+      </w:r>
+      <w:r>
+        <w:rPr>
+          <w:lang w:val="ru-RU"/>
+        </w:rPr>
+        <w:t xml:space="preserve"> </w:t>
+      </w:r>
+      <w:r>
+        <w:rPr>
+          <w:lang w:val="ru-RU"/>
+        </w:rPr>
+        <w:t>файлом.</w:t>
       </w:r>
     </w:p>
     <w:p>
       <w:pPr>
         <w:pStyle w:val="a0"/>
       </w:pPr>
-      <w:proofErr w:type="spellStart"/>
-      <w:r>
-        <w:t>Он</w:t>
-      </w:r>
-      <w:proofErr w:type="spellEnd"/>
-      <w:r>
-        <w:t>:</w:t>
+      <w:r>
+        <w:t>Он:</w:t>
       </w:r>
     </w:p>
     <w:p>
@@ -528,29 +749,8 @@
           <w:numId w:val="4"/>
         </w:numPr>
       </w:pPr>
-      <w:proofErr w:type="spellStart"/>
-      <w:r>
-        <w:t>проверяет</w:t>
-      </w:r>
-      <w:proofErr w:type="spellEnd"/>
-      <w:r>
-        <w:t xml:space="preserve"> </w:t>
-      </w:r>
-      <w:proofErr w:type="spellStart"/>
-      <w:r>
-        <w:t>целостность</w:t>
-      </w:r>
-      <w:proofErr w:type="spellEnd"/>
-      <w:r>
-        <w:t xml:space="preserve"> </w:t>
-      </w:r>
-      <w:proofErr w:type="spellStart"/>
-      <w:r>
-        <w:t>файла</w:t>
-      </w:r>
-      <w:proofErr w:type="spellEnd"/>
-      <w:r>
-        <w:t>.</w:t>
+      <w:r>
+        <w:t>проверяет целостность файла.</w:t>
       </w:r>
     </w:p>
     <w:p>
@@ -613,19 +813,15 @@
       <w:pPr>
         <w:pStyle w:val="a0"/>
       </w:pPr>
-      <w:proofErr w:type="spellStart"/>
-      <w:r>
-        <w:t>Она</w:t>
-      </w:r>
-      <w:proofErr w:type="spellEnd"/>
-      <w:r>
-        <w:t xml:space="preserve"> </w:t>
-      </w:r>
-      <w:proofErr w:type="spellStart"/>
-      <w:r>
-        <w:t>умеет</w:t>
-      </w:r>
-      <w:proofErr w:type="spellEnd"/>
+      <w:r>
+        <w:t xml:space="preserve">Она </w:t>
+      </w:r>
+      <w:r>
+        <w:rPr>
+          <w:lang w:val="ru-RU"/>
+        </w:rPr>
+        <w:t>может</w:t>
+      </w:r>
       <w:r>
         <w:t>:</w:t>
       </w:r>
@@ -699,11 +895,9 @@
       </w:pPr>
       <w:bookmarkStart w:id="8" w:name="financemanager"/>
       <w:bookmarkEnd w:id="7"/>
-      <w:proofErr w:type="spellStart"/>
       <w:r>
         <w:t>FinanceManager</w:t>
       </w:r>
-      <w:proofErr w:type="spellEnd"/>
     </w:p>
     <w:p>
       <w:pPr>
@@ -716,20 +910,36 @@
         <w:rPr>
           <w:lang w:val="ru-RU"/>
         </w:rPr>
-        <w:t>В будущем именно здесь должна находиться бизнес-логика.</w:t>
+        <w:t xml:space="preserve">Отвечает за всю бизнес-логику, к нему обращается </w:t>
+      </w:r>
+      <w:r>
+        <w:t>UI</w:t>
+      </w:r>
+      <w:r>
+        <w:rPr>
+          <w:lang w:val="ru-RU"/>
+        </w:rPr>
+        <w:t xml:space="preserve"> </w:t>
+      </w:r>
+      <w:r>
+        <w:rPr>
+          <w:lang w:val="ru-RU"/>
+        </w:rPr>
+        <w:t>за данными, а менджер, в свою очередь, обрабатывает запрос и обращается к хранилищу.</w:t>
       </w:r>
     </w:p>
     <w:p>
       <w:pPr>
         <w:pStyle w:val="a0"/>
-      </w:pPr>
-      <w:proofErr w:type="spellStart"/>
-      <w:r>
-        <w:t>Например</w:t>
-      </w:r>
-      <w:proofErr w:type="spellEnd"/>
-      <w:r>
-        <w:t>:</w:t>
+        <w:rPr>
+          <w:lang w:val="ru-RU"/>
+        </w:rPr>
+      </w:pPr>
+      <w:r>
+        <w:rPr>
+          <w:lang w:val="ru-RU"/>
+        </w:rPr>
+        <w:t>Пример действий:</w:t>
       </w:r>
     </w:p>
     <w:p>
@@ -739,9 +949,28 @@
           <w:ilvl w:val="0"/>
           <w:numId w:val="6"/>
         </w:numPr>
-      </w:pPr>
-      <w:r>
-        <w:t>получить операции за месяц;</w:t>
+        <w:rPr>
+          <w:lang w:val="ru-RU"/>
+        </w:rPr>
+      </w:pPr>
+      <w:r>
+        <w:rPr>
+          <w:lang w:val="ru-RU"/>
+        </w:rPr>
+        <w:lastRenderedPageBreak/>
+        <w:t xml:space="preserve">получить </w:t>
+      </w:r>
+      <w:r>
+        <w:rPr>
+          <w:lang w:val="ru-RU"/>
+        </w:rPr>
+        <w:t xml:space="preserve">список </w:t>
+      </w:r>
+      <w:r>
+        <w:rPr>
+          <w:lang w:val="ru-RU"/>
+        </w:rPr>
+        <w:t>операции за месяц;</w:t>
       </w:r>
     </w:p>
     <w:p>
@@ -777,7 +1006,6 @@
         </w:numPr>
       </w:pPr>
       <w:r>
-        <w:lastRenderedPageBreak/>
         <w:t>удалить операцию;</w:t>
       </w:r>
     </w:p>
@@ -796,9 +1024,48 @@
     <w:p>
       <w:pPr>
         <w:pStyle w:val="FirstParagraph"/>
-      </w:pPr>
-      <w:r>
-        <w:t>Storage лишь предоставляет данные.</w:t>
+        <w:rPr>
+          <w:lang w:val="ru-RU"/>
+        </w:rPr>
+      </w:pPr>
+      <w:r>
+        <w:t>Storage</w:t>
+      </w:r>
+      <w:r>
+        <w:rPr>
+          <w:lang w:val="ru-RU"/>
+        </w:rPr>
+        <w:t xml:space="preserve"> лишь предоставляет данные</w:t>
+      </w:r>
+      <w:r>
+        <w:rPr>
+          <w:lang w:val="ru-RU"/>
+        </w:rPr>
+        <w:t xml:space="preserve"> и </w:t>
+      </w:r>
+      <w:r>
+        <w:t>API</w:t>
+      </w:r>
+      <w:r>
+        <w:rPr>
+          <w:lang w:val="ru-RU"/>
+        </w:rPr>
+        <w:t xml:space="preserve"> </w:t>
+      </w:r>
+      <w:r>
+        <w:rPr>
+          <w:lang w:val="ru-RU"/>
+        </w:rPr>
+        <w:t xml:space="preserve">для работы с текстом в файле </w:t>
+      </w:r>
+      <w:r>
+        <w:t>json</w:t>
+      </w:r>
+      <w:r>
+        <w:rPr>
+          <w:lang w:val="ru-RU"/>
+        </w:rPr>
+        <w:t>.</w:t>
       </w:r>
     </w:p>
     <w:p>
@@ -825,6 +1092,12 @@
         </w:rPr>
         <w:t>Архитектурные правила</w:t>
       </w:r>
+      <w:r>
+        <w:rPr>
+          <w:lang w:val="ru-RU"/>
+        </w:rPr>
+        <w:t xml:space="preserve"> (промпт дли ИИ)</w:t>
+      </w:r>
     </w:p>
     <w:p>
       <w:pPr>
@@ -851,7 +1124,19 @@
         <w:rPr>
           <w:lang w:val="ru-RU"/>
         </w:rPr>
-        <w:t>“Какую ответственность он берет на себя?”</w:t>
+        <w:t>«</w:t>
+      </w:r>
+      <w:r>
+        <w:rPr>
+          <w:lang w:val="ru-RU"/>
+        </w:rPr>
+        <w:t>Какую ответственность он берет на себя?</w:t>
+      </w:r>
+      <w:r>
+        <w:rPr>
+          <w:lang w:val="ru-RU"/>
+        </w:rPr>
+        <w:t>»</w:t>
       </w:r>
     </w:p>
     <w:p>
@@ -959,7 +1244,31 @@
         <w:rPr>
           <w:lang w:val="ru-RU"/>
         </w:rPr>
-        <w:t>Команда “Добавить операцию” — не сущность.</w:t>
+        <w:t xml:space="preserve">Команда </w:t>
+      </w:r>
+      <w:r>
+        <w:rPr>
+          <w:lang w:val="ru-RU"/>
+        </w:rPr>
+        <w:t>«</w:t>
+      </w:r>
+      <w:r>
+        <w:rPr>
+          <w:lang w:val="ru-RU"/>
+        </w:rPr>
+        <w:t>Добавить операцию</w:t>
+      </w:r>
+      <w:r>
+        <w:rPr>
+          <w:lang w:val="ru-RU"/>
+        </w:rPr>
+        <w:t>»</w:t>
+      </w:r>
+      <w:r>
+        <w:rPr>
+          <w:lang w:val="ru-RU"/>
+        </w:rPr>
+        <w:t xml:space="preserve"> — не сущность.</w:t>
       </w:r>
     </w:p>
     <w:p>
@@ -984,6 +1293,12 @@
         </w:rPr>
         <w:t>Подход к разработке</w:t>
       </w:r>
+      <w:r>
+        <w:rPr>
+          <w:lang w:val="ru-RU"/>
+        </w:rPr>
+        <w:t xml:space="preserve"> (промпт дли ИИ)</w:t>
+      </w:r>
     </w:p>
     <w:p>
       <w:pPr>
@@ -996,7 +1311,7 @@
         <w:rPr>
           <w:lang w:val="ru-RU"/>
         </w:rPr>
-        <w:t>Разработка идёт не снизу вверх (“сначала классы”), а сверху вниз.</w:t>
+        <w:t>Разработка идёт не снизу вверх (сначала классы), а сверху вниз.</w:t>
       </w:r>
     </w:p>
     <w:p>
@@ -1031,21 +1346,8 @@
       <w:pPr>
         <w:pStyle w:val="a0"/>
       </w:pPr>
-      <w:proofErr w:type="spellStart"/>
-      <w:r>
-        <w:t>Добавить</w:t>
-      </w:r>
-      <w:proofErr w:type="spellEnd"/>
-      <w:r>
-        <w:t xml:space="preserve"> </w:t>
-      </w:r>
-      <w:proofErr w:type="spellStart"/>
-      <w:r>
-        <w:t>операцию</w:t>
-      </w:r>
-      <w:proofErr w:type="spellEnd"/>
-      <w:r>
-        <w:t>.</w:t>
+      <w:r>
+        <w:t>Добавить операцию.</w:t>
       </w:r>
     </w:p>
     <w:p>
@@ -1103,6 +1405,7 @@
         <w:rPr>
           <w:lang w:val="ru-RU"/>
         </w:rPr>
+        <w:lastRenderedPageBreak/>
         <w:t>Архитектура должна постепенно вырастать из требований проекта.</w:t>
       </w:r>
     </w:p>
@@ -1126,9 +1429,14 @@
         <w:rPr>
           <w:lang w:val="ru-RU"/>
         </w:rPr>
-        <w:lastRenderedPageBreak/>
         <w:t>Приоритеты</w:t>
       </w:r>
+      <w:r>
+        <w:rPr>
+          <w:lang w:val="ru-RU"/>
+        </w:rPr>
+        <w:t xml:space="preserve"> (промпт дли ИИ)</w:t>
+      </w:r>
     </w:p>
     <w:p>
       <w:pPr>
@@ -1152,29 +1460,8 @@
           <w:numId w:val="8"/>
         </w:numPr>
       </w:pPr>
-      <w:proofErr w:type="spellStart"/>
-      <w:r>
-        <w:t>Правильное</w:t>
-      </w:r>
-      <w:proofErr w:type="spellEnd"/>
-      <w:r>
-        <w:t xml:space="preserve"> </w:t>
-      </w:r>
-      <w:proofErr w:type="spellStart"/>
-      <w:r>
-        <w:t>разделение</w:t>
-      </w:r>
-      <w:proofErr w:type="spellEnd"/>
-      <w:r>
-        <w:t xml:space="preserve"> </w:t>
-      </w:r>
-      <w:proofErr w:type="spellStart"/>
-      <w:r>
-        <w:t>ответственности</w:t>
-      </w:r>
-      <w:proofErr w:type="spellEnd"/>
-      <w:r>
-        <w:t>.</w:t>
+      <w:r>
+        <w:t>Правильное разделение ответственности.</w:t>
       </w:r>
     </w:p>
     <w:p>
@@ -1253,6 +1540,12 @@
         </w:rPr>
         <w:t>Что не нужно делать</w:t>
       </w:r>
+      <w:r>
+        <w:rPr>
+          <w:lang w:val="ru-RU"/>
+        </w:rPr>
+        <w:t xml:space="preserve"> (промпт дли ИИ)</w:t>
+      </w:r>
     </w:p>
     <w:p>
       <w:pPr>
@@ -1276,29 +1569,8 @@
           <w:numId w:val="9"/>
         </w:numPr>
       </w:pPr>
-      <w:proofErr w:type="spellStart"/>
-      <w:r>
-        <w:t>преждевременное</w:t>
-      </w:r>
-      <w:proofErr w:type="spellEnd"/>
-      <w:r>
-        <w:t xml:space="preserve"> </w:t>
-      </w:r>
-      <w:proofErr w:type="spellStart"/>
-      <w:r>
-        <w:t>внедрение</w:t>
-      </w:r>
-      <w:proofErr w:type="spellEnd"/>
-      <w:r>
-        <w:t xml:space="preserve"> </w:t>
-      </w:r>
-      <w:proofErr w:type="spellStart"/>
-      <w:r>
-        <w:t>паттернов</w:t>
-      </w:r>
-      <w:proofErr w:type="spellEnd"/>
-      <w:r>
-        <w:t>;</w:t>
+      <w:r>
+        <w:t>преждевременное внедрение паттернов;</w:t>
       </w:r>
     </w:p>
     <w:p>
@@ -1328,7 +1600,31 @@
         <w:rPr>
           <w:lang w:val="ru-RU"/>
         </w:rPr>
-        <w:t>абстракции “на будущее”, если они пока не нужны;</w:t>
+        <w:t xml:space="preserve">абстракции </w:t>
+      </w:r>
+      <w:r>
+        <w:rPr>
+          <w:lang w:val="ru-RU"/>
+        </w:rPr>
+        <w:t>«</w:t>
+      </w:r>
+      <w:r>
+        <w:rPr>
+          <w:lang w:val="ru-RU"/>
+        </w:rPr>
+        <w:t>на будущее</w:t>
+      </w:r>
+      <w:r>
+        <w:rPr>
+          <w:lang w:val="ru-RU"/>
+        </w:rPr>
+        <w:t>»</w:t>
+      </w:r>
+      <w:r>
+        <w:rPr>
+          <w:lang w:val="ru-RU"/>
+        </w:rPr>
+        <w:t>, если они пока не нужны;</w:t>
       </w:r>
     </w:p>
     <w:p>
@@ -1378,7 +1674,31 @@
         <w:rPr>
           <w:lang w:val="ru-RU"/>
         </w:rPr>
-        <w:t xml:space="preserve"> Если новый класс, метод или слой появляются только потому, что "когда-нибудь пригодится", то, скорее всего, их пока не нужно создавать. Архитектура должна расти вместе с функциональностью проекта, а не опережать её.</w:t>
+        <w:t xml:space="preserve"> Если новый класс, метод или слой появляются только потому, что </w:t>
+      </w:r>
+      <w:r>
+        <w:rPr>
+          <w:lang w:val="ru-RU"/>
+        </w:rPr>
+        <w:t>«</w:t>
+      </w:r>
+      <w:r>
+        <w:rPr>
+          <w:lang w:val="ru-RU"/>
+        </w:rPr>
+        <w:t>когда-нибудь пригодится</w:t>
+      </w:r>
+      <w:r>
+        <w:rPr>
+          <w:lang w:val="ru-RU"/>
+        </w:rPr>
+        <w:t>»</w:t>
+      </w:r>
+      <w:r>
+        <w:rPr>
+          <w:lang w:val="ru-RU"/>
+        </w:rPr>
+        <w:t>, то, скорее всего, их пока не нужно создавать. Архитектура должна расти вместе с функциональностью проекта, а не опережать её.</w:t>
       </w:r>
     </w:p>
     <w:p>
@@ -1403,6 +1723,12 @@
         </w:rPr>
         <w:t>Формат ответов</w:t>
       </w:r>
+      <w:r>
+        <w:rPr>
+          <w:lang w:val="ru-RU"/>
+        </w:rPr>
+        <w:t xml:space="preserve"> для ИИ</w:t>
+      </w:r>
     </w:p>
     <w:p>
       <w:pPr>
@@ -1426,36 +1752,55 @@
           <w:numId w:val="10"/>
         </w:numPr>
       </w:pPr>
-      <w:proofErr w:type="spellStart"/>
-      <w:r>
-        <w:t>сначала</w:t>
-      </w:r>
-      <w:proofErr w:type="spellEnd"/>
-      <w:r>
-        <w:t xml:space="preserve"> </w:t>
-      </w:r>
-      <w:proofErr w:type="spellStart"/>
-      <w:r>
-        <w:t>оценить</w:t>
-      </w:r>
-      <w:proofErr w:type="spellEnd"/>
-      <w:r>
-        <w:t xml:space="preserve"> </w:t>
-      </w:r>
-      <w:proofErr w:type="spellStart"/>
-      <w:r>
-        <w:t>архитектурное</w:t>
-      </w:r>
-      <w:proofErr w:type="spellEnd"/>
-      <w:r>
-        <w:t xml:space="preserve"> </w:t>
-      </w:r>
-      <w:proofErr w:type="spellStart"/>
-      <w:r>
-        <w:t>решение</w:t>
-      </w:r>
-      <w:proofErr w:type="spellEnd"/>
-      <w:r>
+      <w:r>
+        <w:t>сначала оценить архитектурное решение;</w:t>
+      </w:r>
+    </w:p>
+    <w:p>
+      <w:pPr>
+        <w:pStyle w:val="Compact"/>
+        <w:numPr>
+          <w:ilvl w:val="0"/>
+          <w:numId w:val="10"/>
+        </w:numPr>
+      </w:pPr>
+      <w:r>
+        <w:t>затем указать реальные проблемы;</w:t>
+      </w:r>
+    </w:p>
+    <w:p>
+      <w:pPr>
+        <w:pStyle w:val="Compact"/>
+        <w:numPr>
+          <w:ilvl w:val="0"/>
+          <w:numId w:val="10"/>
+        </w:numPr>
+      </w:pPr>
+      <w:r>
+        <w:t>затем предложить возможные улучшения;</w:t>
+      </w:r>
+    </w:p>
+    <w:p>
+      <w:pPr>
+        <w:pStyle w:val="Compact"/>
+        <w:numPr>
+          <w:ilvl w:val="0"/>
+          <w:numId w:val="10"/>
+        </w:numPr>
+        <w:rPr>
+          <w:lang w:val="ru-RU"/>
+        </w:rPr>
+      </w:pPr>
+      <w:r>
+        <w:rPr>
+          <w:lang w:val="ru-RU"/>
+        </w:rPr>
+        <w:t>объяснять именно причины, а не только конечный вариант</w:t>
+      </w:r>
+      <w:r>
+        <w:rPr>
+          <w:lang w:val="ru-RU"/>
+        </w:rPr>
         <w:t>;</w:t>
       </w:r>
     </w:p>
@@ -1466,39 +1811,33 @@
           <w:ilvl w:val="0"/>
           <w:numId w:val="10"/>
         </w:numPr>
-      </w:pPr>
-      <w:r>
-        <w:t>затем указать реальные проблемы;</w:t>
-      </w:r>
-    </w:p>
-    <w:p>
-      <w:pPr>
-        <w:pStyle w:val="Compact"/>
-        <w:numPr>
-          <w:ilvl w:val="0"/>
-          <w:numId w:val="10"/>
-        </w:numPr>
-      </w:pPr>
-      <w:r>
-        <w:t>затем предложить возможные улучшения;</w:t>
-      </w:r>
-    </w:p>
-    <w:p>
-      <w:pPr>
-        <w:pStyle w:val="Compact"/>
-        <w:numPr>
-          <w:ilvl w:val="0"/>
-          <w:numId w:val="10"/>
-        </w:numPr>
-        <w:rPr>
-          <w:lang w:val="ru-RU"/>
-        </w:rPr>
-      </w:pPr>
-      <w:r>
-        <w:rPr>
-          <w:lang w:val="ru-RU"/>
-        </w:rPr>
-        <w:t>объяснять именно причины, а не только конечный вариант.</w:t>
+        <w:rPr>
+          <w:lang w:val="ru-RU"/>
+        </w:rPr>
+      </w:pPr>
+      <w:r>
+        <w:rPr>
+          <w:lang w:val="ru-RU"/>
+        </w:rPr>
+        <w:t>при указывании на проблемы и</w:t>
+      </w:r>
+      <w:r>
+        <w:rPr>
+          <w:lang w:val="ru-RU"/>
+        </w:rPr>
+        <w:t>/</w:t>
+      </w:r>
+      <w:r>
+        <w:rPr>
+          <w:lang w:val="ru-RU"/>
+        </w:rPr>
+        <w:t>или предложении улучшений следует указывать, в какой класс и какой метод предлагается внести изменения</w:t>
+      </w:r>
+      <w:r>
+        <w:rPr>
+          <w:lang w:val="ru-RU"/>
+        </w:rPr>
+        <w:t>.</w:t>
       </w:r>
     </w:p>
     <w:p>
@@ -1512,7 +1851,43 @@
         <w:rPr>
           <w:lang w:val="ru-RU"/>
         </w:rPr>
-        <w:t>Если решение является приемлемым для текущего масштаба проекта, не стоит советовать переписывать его только ради “идеальности”.</w:t>
+        <w:t xml:space="preserve">Если </w:t>
+      </w:r>
+      <w:r>
+        <w:rPr>
+          <w:lang w:val="ru-RU"/>
+        </w:rPr>
+        <w:t xml:space="preserve">реализованное </w:t>
+      </w:r>
+      <w:r>
+        <w:rPr>
+          <w:lang w:val="ru-RU"/>
+        </w:rPr>
+        <w:t xml:space="preserve">решение является приемлемым для текущего масштаба проекта, не стоит советовать переписывать его только ради </w:t>
+      </w:r>
+      <w:r>
+        <w:rPr>
+          <w:lang w:val="ru-RU"/>
+        </w:rPr>
+        <w:t>«</w:t>
+      </w:r>
+      <w:r>
+        <w:rPr>
+          <w:lang w:val="ru-RU"/>
+        </w:rPr>
+        <w:t>идеальности</w:t>
+      </w:r>
+      <w:r>
+        <w:rPr>
+          <w:lang w:val="ru-RU"/>
+        </w:rPr>
+        <w:t>»</w:t>
+      </w:r>
+      <w:r>
+        <w:rPr>
+          <w:lang w:val="ru-RU"/>
+        </w:rPr>
+        <w:t>.</w:t>
       </w:r>
       <w:bookmarkEnd w:id="13"/>
     </w:p>
@@ -2324,6 +2699,7 @@
   <w:style w:type="character" w:default="1" w:styleId="a1">
     <w:name w:val="Default Paragraph Font"/>
     <w:uiPriority w:val="1"/>
+    <w:semiHidden/>
     <w:unhideWhenUsed/>
   </w:style>
   <w:style w:type="table" w:default="1" w:styleId="a2">

</xml_diff>